<commit_message>
docs: update chapter 1 manuscript setup
</commit_message>
<xml_diff>
--- a/manuscript/current/chuong_1_sach_chuyen_khao.docx
+++ b/manuscript/current/chuong_1_sach_chuyen_khao.docx
@@ -377,13 +377,7 @@
         <w:ind w:firstLine="709"/>
       </w:pPr>
       <w:r>
-        <w:t>Để lượng hóa rủi ro đuôi, hai thước đo được sử dụng rộng rãi nhất là Value-at-Risk (VaR) và Expected Shortfall (ES). VaR tập trung vào việc xác định một ngưỡng tổn thất tại mức tin cậy cho trước. Chẳng hạn, VaR 99% cho biết mức lỗ mà danh mục chỉ có xác suất khoảng 1% vượt quá trong kỳ hạn nắm giữ được xét. Tuy nhiên, VaR chỉ cho biết vị trí của ngưỡng tổn thất mà không phản ánh mức độ nghiêm trọng của các khoản lỗ khi ngưỡng đó đã bị vượt qua. Để khắc phục hạn chế này, Expected Shortfall (ES) đo mức tổn thất trung bình trong những trường hợp xấu nhất vượt quá VaR. Vì vậy, nếu VaR trả lời câu hỏi “ngưỡng lỗ là bao nhiêu?”, thì ES trả lời câu hỏi “nếu đã vượt ngưỡng đó, mức lỗ trung bình sẽ là bao nhiêu?”.</w:t>
-      </w:r>
-      <w:r>
-        <w:t xml:space="preserve"> </w:t>
-      </w:r>
-      <w:r>
-        <w:t>VaR và ES đều là những công cụ cốt lõi trong quản trị rủi ro thị trường hiện đại. Trong cuốn sách này, hai thước đo sẽ được trình bày chi tiết ở các chương sau, bao gồm cơ sở lý thuyết, phương pháp ước lượng, ưu nhược điểm và các ứng dụng thực tiễn trong đo lường rủi ro tài chính</w:t>
+        <w:t>Để lượng hóa rủi ro đuôi, hai thước đo được sử dụng rộng rãi nhất là Value-at-Risk (VaR) và Expected Shortfall (ES). VaR tập trung vào việc xác định một ngưỡng tổn thất tại mức tin cậy cho trước. Chẳng hạn, VaR 99% cho biết mức lỗ mà danh mục chỉ có xác suất khoảng 1% vượt quá trong kỳ hạn nắm giữ được xét. Tuy nhiên, VaR chỉ cho biết vị trí của ngưỡng tổn thất mà không phản ánh mức độ nghiêm trọng của các khoản lỗ khi ngưỡng đó đã bị vượt qua. Để khắc phục hạn chế này, Expected Shortfall (ES) đo mức tổn thất trung bình trong những trường hợp xấu nhất vượt quá VaR. Vì vậy, nếu VaR trả lời câu hỏi “ngưỡng lỗ là bao nhiêu?”, thì ES trả lời câu hỏi “nếu đã vượt ngưỡng đó, mức lỗ trung bình sẽ là bao nhiêu?”. VaR và ES đều là những công cụ cốt lõi trong quản trị rủi ro thị trường hiện đại. Trong cuốn sách này, hai thước đo sẽ được trình bày chi tiết ở các chương sau, bao gồm cơ sở lý thuyết, phương pháp ước lượng, ưu nhược điểm và các ứng dụng thực tiễn trong đo lường rủi ro tài chính</w:t>
       </w:r>
     </w:p>
     <w:p>
@@ -471,7 +465,7 @@
         <w:ind w:left="-11" w:firstLine="720"/>
       </w:pPr>
       <w:r>
-        <w:t>Đối với các quỹ đầu tư, công ty quản lý quỹ và các tổ chức đầu tư chuyên nghiệp, biến động tỷ lệ sinh lời là chỉ tiêu được sử dụng thường xuyên nhất trong quản lý danh mục và đánh giá hiệu quả đầu tư. Nhiều quỹ đầu tư áp dụng các giới hạn nội bộ về độ biến động danh mục, mức độ sai lệch dự báo, VaR hoặc ES nhằm kiểm soát mức độ rủi ro phù hợp với mục tiêu đầu tư đã công bố. Tại Hoa Kỳ, Ủy ban Chứng khoán và Giao dịch Hoa Kỳ (SEC) yêu cầu các quỹ đầu tư công bố đầy đủ các rủi ro trọng yếu liên quan đến chiến lược đầu tư và quản trị thanh khoản. Đối với các quỹ sử dụng công cụ phái sinh, Quy tắc 18f-4 của SEC (2020) yêu cầu nhiều quỹ phải xây dựng chương trình quản lý rủi ro phái sinh, trong đó VaR được sử dụng như một thước đo trung tâm để kiểm soát mức độ đòn bẩy và rủi ro thị trường của danh mục. v=Tại châu Âu, các quỹ UCITS (Undertakings for Collective Investment in Transferable Securities) được phép sử dụng phương pháp VaR tuyệt đối hoặc VaR tương đối để giám sát rủi ro danh mục khi sử dụng công cụ phái sinh ở mức độ đáng kể. Theo hướng dẫn của Cơ quan Chứng khoán và Thị trường châu Âu (ESMA), VaR phải được tính toán và giám sát thường xuyên, đồng thời kết hợp với stress testing để đánh giá các tình huống thị trường cực đoan.</w:t>
+        <w:t>Đối với các quỹ đầu tư, công ty quản lý quỹ và các tổ chức đầu tư chuyên nghiệp, biến động tỷ lệ sinh lời là chỉ tiêu được sử dụng thường xuyên nhất trong quản lý danh mục và đánh giá hiệu quả đầu tư. Nhiều quỹ đầu tư áp dụng các giới hạn nội bộ về độ biến động danh mục, mức độ sai lệch dự báo, VaR hoặc ES nhằm kiểm soát mức độ rủi ro phù hợp với mục tiêu đầu tư đã công bố. Tại Hoa Kỳ, Ủy ban Chứng khoán và Giao dịch Hoa Kỳ (SEC) yêu cầu các quỹ đầu tư công bố đầy đủ các rủi ro trọng yếu liên quan đến chiến lược đầu tư và quản trị thanh khoản. Đối với các quỹ sử dụng công cụ phái sinh, Quy tắc 18f-4 của SEC (2020) yêu cầu nhiều quỹ phải xây dựng chương trình quản lý rủi ro phái sinh, trong đó VaR được sử dụng như một thước đo trung tâm để kiểm soát mức độ đòn bẩy và rủi ro thị trường của danh mục. Tại châu Âu, các quỹ UCITS (Undertakings for Collective Investment in Transferable Securities) được phép sử dụng phương pháp VaR tuyệt đối hoặc VaR tương đối để giám sát rủi ro danh mục khi sử dụng công cụ phái sinh ở mức độ đáng kể. Theo hướng dẫn của Cơ quan Chứng khoán và Thị trường châu Âu (ESMA), VaR phải được tính toán và giám sát thường xuyên, đồng thời kết hợp với stress testing để đánh giá các tình huống thị trường cực đoan.</w:t>
       </w:r>
     </w:p>
     <w:p>
@@ -505,14 +499,7 @@
           <w:b/>
           <w:bCs/>
         </w:rPr>
-        <w:t>Ý</w:t>
-      </w:r>
-      <w:r>
-        <w:rPr>
-          <w:b/>
-          <w:bCs/>
-        </w:rPr>
-        <w:t xml:space="preserve"> nghĩa của đo lường biến động và rủi ro đuôi trên thị trường chứng khoán Việt Nam</w:t>
+        <w:t>Ý nghĩa của đo lường biến động và rủi ro đuôi trên thị trường chứng khoán Việt Nam</w:t>
       </w:r>
     </w:p>
     <w:p>
@@ -547,7 +534,7 @@
         <w:pStyle w:val="Heading2"/>
         <w:numPr>
           <w:ilvl w:val="1"/>
-          <w:numId w:val="3"/>
+          <w:numId w:val="5"/>
         </w:numPr>
       </w:pPr>
       <w:r>
@@ -562,7 +549,7 @@
         <w:pStyle w:val="Heading3"/>
         <w:numPr>
           <w:ilvl w:val="2"/>
-          <w:numId w:val="3"/>
+          <w:numId w:val="5"/>
         </w:numPr>
       </w:pPr>
       <w:bookmarkStart w:id="2" w:name="sec-why-returns"/>

</xml_diff>